<commit_message>
vault backup: 2026-03-12 15:01:22
</commit_message>
<xml_diff>
--- a/Pitch de subrunner.docx
+++ b/Pitch de subrunner.docx
@@ -168,294 +168,366 @@
         <w:rPr>
           <w:b/>
           <w:bCs/>
-          <w:sz w:val="28"/>
-          <w:szCs w:val="28"/>
-        </w:rPr>
-      </w:pPr>
-    </w:p>
-    <w:p>
-      <w:pPr>
-        <w:rPr>
-          <w:b/>
-          <w:bCs/>
           <w:sz w:val="32"/>
           <w:szCs w:val="32"/>
         </w:rPr>
       </w:pPr>
-      <w:r>
+    </w:p>
+    <w:p>
+      <w:pPr>
+        <w:rPr>
+          <w:b/>
+          <w:bCs/>
+          <w:sz w:val="36"/>
+          <w:szCs w:val="36"/>
+        </w:rPr>
+      </w:pPr>
+      <w:r>
+        <w:rPr>
+          <w:b/>
+          <w:bCs/>
+          <w:sz w:val="36"/>
+          <w:szCs w:val="36"/>
+        </w:rPr>
+        <w:t>Description globale du jeu :</w:t>
+      </w:r>
+    </w:p>
+    <w:p>
+      <w:pPr>
+        <w:rPr>
+          <w:sz w:val="28"/>
+          <w:szCs w:val="28"/>
+        </w:rPr>
+      </w:pPr>
+      <w:r>
+        <w:rPr>
+          <w:sz w:val="28"/>
+          <w:szCs w:val="28"/>
+        </w:rPr>
+        <w:t xml:space="preserve">On incarne un </w:t>
+      </w:r>
+      <w:r>
+        <w:rPr>
+          <w:b/>
+          <w:bCs/>
+          <w:sz w:val="28"/>
+          <w:szCs w:val="28"/>
+        </w:rPr>
+        <w:t>ninja hacker</w:t>
+      </w:r>
+      <w:r>
+        <w:rPr>
+          <w:sz w:val="28"/>
+          <w:szCs w:val="28"/>
+        </w:rPr>
+        <w:t xml:space="preserve"> dans un souterrain labyrinthique qui doit retrouver la </w:t>
+      </w:r>
+      <w:r>
+        <w:rPr>
+          <w:b/>
+          <w:bCs/>
+          <w:sz w:val="28"/>
+          <w:szCs w:val="28"/>
+        </w:rPr>
+        <w:t>surface</w:t>
+      </w:r>
+      <w:r>
+        <w:rPr>
+          <w:b/>
+          <w:bCs/>
+          <w:sz w:val="28"/>
+          <w:szCs w:val="28"/>
+        </w:rPr>
+        <w:t>.</w:t>
+      </w:r>
+    </w:p>
+    <w:p>
+      <w:pPr>
+        <w:rPr>
+          <w:sz w:val="28"/>
+          <w:szCs w:val="28"/>
+        </w:rPr>
+      </w:pPr>
+      <w:r>
+        <w:rPr>
+          <w:sz w:val="28"/>
+          <w:szCs w:val="28"/>
+        </w:rPr>
+        <w:t xml:space="preserve">On doit survivre aux attaques de zombies, de policiers, de robots et autres ennemis qui nous haïssent profondément </w:t>
+      </w:r>
+      <w:proofErr w:type="spellStart"/>
+      <w:r>
+        <w:rPr>
+          <w:sz w:val="28"/>
+          <w:szCs w:val="28"/>
+        </w:rPr>
+        <w:t>apparement</w:t>
+      </w:r>
+      <w:proofErr w:type="spellEnd"/>
+      <w:r>
+        <w:rPr>
+          <w:sz w:val="28"/>
+          <w:szCs w:val="28"/>
+        </w:rPr>
+        <w:t>.</w:t>
+      </w:r>
+    </w:p>
+    <w:p>
+      <w:pPr>
+        <w:rPr>
+          <w:sz w:val="28"/>
+          <w:szCs w:val="28"/>
+        </w:rPr>
+      </w:pPr>
+      <w:r>
+        <w:rPr>
+          <w:sz w:val="28"/>
+          <w:szCs w:val="28"/>
+        </w:rPr>
+        <w:t xml:space="preserve">On a des </w:t>
+      </w:r>
+      <w:r>
+        <w:rPr>
+          <w:b/>
+          <w:bCs/>
+          <w:sz w:val="28"/>
+          <w:szCs w:val="28"/>
+        </w:rPr>
+        <w:t>chaussures</w:t>
+      </w:r>
+      <w:r>
+        <w:rPr>
+          <w:sz w:val="28"/>
+          <w:szCs w:val="28"/>
+        </w:rPr>
+        <w:t xml:space="preserve"> pour esquiver, un </w:t>
+      </w:r>
+      <w:r>
+        <w:rPr>
+          <w:b/>
+          <w:bCs/>
+          <w:sz w:val="28"/>
+          <w:szCs w:val="28"/>
+        </w:rPr>
+        <w:t>katana</w:t>
+      </w:r>
+      <w:r>
+        <w:rPr>
+          <w:sz w:val="28"/>
+          <w:szCs w:val="28"/>
+        </w:rPr>
+        <w:t xml:space="preserve"> pour attaquer, et un </w:t>
+      </w:r>
+      <w:r>
+        <w:rPr>
+          <w:b/>
+          <w:bCs/>
+          <w:sz w:val="28"/>
+          <w:szCs w:val="28"/>
+        </w:rPr>
+        <w:t>ordinateur portable</w:t>
+      </w:r>
+      <w:r>
+        <w:rPr>
+          <w:sz w:val="28"/>
+          <w:szCs w:val="28"/>
+        </w:rPr>
+        <w:t xml:space="preserve"> pour hacker des portes, des ordinateurs </w:t>
+      </w:r>
+      <w:proofErr w:type="spellStart"/>
+      <w:r>
+        <w:rPr>
+          <w:sz w:val="28"/>
+          <w:szCs w:val="28"/>
+        </w:rPr>
+        <w:t>etc</w:t>
+      </w:r>
+      <w:proofErr w:type="spellEnd"/>
+      <w:r>
+        <w:rPr>
+          <w:sz w:val="28"/>
+          <w:szCs w:val="28"/>
+        </w:rPr>
+        <w:t xml:space="preserve"> </w:t>
+      </w:r>
+      <w:proofErr w:type="spellStart"/>
+      <w:r>
+        <w:rPr>
+          <w:sz w:val="28"/>
+          <w:szCs w:val="28"/>
+        </w:rPr>
+        <w:t>etc</w:t>
+      </w:r>
+      <w:proofErr w:type="spellEnd"/>
+    </w:p>
+    <w:p>
+      <w:pPr>
+        <w:rPr>
+          <w:sz w:val="28"/>
+          <w:szCs w:val="28"/>
+        </w:rPr>
+      </w:pPr>
+      <w:r>
+        <w:rPr>
+          <w:sz w:val="28"/>
+          <w:szCs w:val="28"/>
+        </w:rPr>
+        <w:t xml:space="preserve">On doit trouver des </w:t>
+      </w:r>
+      <w:r>
+        <w:rPr>
+          <w:b/>
+          <w:bCs/>
+          <w:sz w:val="28"/>
+          <w:szCs w:val="28"/>
+        </w:rPr>
+        <w:t>clés</w:t>
+      </w:r>
+      <w:r>
+        <w:rPr>
+          <w:b/>
+          <w:bCs/>
+          <w:sz w:val="28"/>
+          <w:szCs w:val="28"/>
+        </w:rPr>
+        <w:t xml:space="preserve"> d’ascenseur</w:t>
+      </w:r>
+      <w:r>
+        <w:rPr>
+          <w:sz w:val="28"/>
+          <w:szCs w:val="28"/>
+        </w:rPr>
+        <w:t xml:space="preserve"> dans les étages qui nous permettent de débloquer les étages suivants, et donc de s’approcher de la surface.</w:t>
+      </w:r>
+    </w:p>
+    <w:p>
+      <w:pPr>
         <w:rPr>
           <w:b/>
           <w:bCs/>
           <w:sz w:val="32"/>
           <w:szCs w:val="32"/>
         </w:rPr>
-        <w:t>Description globale du jeu :</w:t>
-      </w:r>
-    </w:p>
-    <w:p>
-      <w:pPr>
-        <w:rPr>
-          <w:sz w:val="28"/>
-          <w:szCs w:val="28"/>
-        </w:rPr>
-      </w:pPr>
-      <w:r>
-        <w:rPr>
-          <w:sz w:val="28"/>
-          <w:szCs w:val="28"/>
-        </w:rPr>
-        <w:t xml:space="preserve">On incarne un </w:t>
-      </w:r>
-      <w:r>
-        <w:rPr>
-          <w:b/>
-          <w:bCs/>
-          <w:sz w:val="28"/>
-          <w:szCs w:val="28"/>
-        </w:rPr>
-        <w:t>ninja hacker</w:t>
-      </w:r>
-      <w:r>
-        <w:rPr>
-          <w:sz w:val="28"/>
-          <w:szCs w:val="28"/>
-        </w:rPr>
-        <w:t xml:space="preserve"> dans un souterrain labyrinthique qui doit retrouver la </w:t>
-      </w:r>
-      <w:r>
-        <w:rPr>
-          <w:b/>
-          <w:bCs/>
-          <w:sz w:val="28"/>
-          <w:szCs w:val="28"/>
-        </w:rPr>
-        <w:t>surface</w:t>
-      </w:r>
-      <w:r>
-        <w:rPr>
-          <w:b/>
-          <w:bCs/>
-          <w:sz w:val="28"/>
-          <w:szCs w:val="28"/>
-        </w:rPr>
-        <w:t>.</w:t>
-      </w:r>
-    </w:p>
-    <w:p>
-      <w:pPr>
-        <w:rPr>
-          <w:sz w:val="28"/>
-          <w:szCs w:val="28"/>
-        </w:rPr>
-      </w:pPr>
-      <w:r>
-        <w:rPr>
-          <w:sz w:val="28"/>
-          <w:szCs w:val="28"/>
-        </w:rPr>
-        <w:t xml:space="preserve">On doit survivre aux attaques de zombies, de policiers, de robots et autres ennemis qui nous haïssent profondément </w:t>
-      </w:r>
-      <w:proofErr w:type="spellStart"/>
-      <w:r>
-        <w:rPr>
-          <w:sz w:val="28"/>
-          <w:szCs w:val="28"/>
-        </w:rPr>
-        <w:t>apparement</w:t>
-      </w:r>
-      <w:proofErr w:type="spellEnd"/>
-      <w:r>
-        <w:rPr>
-          <w:sz w:val="28"/>
-          <w:szCs w:val="28"/>
-        </w:rPr>
-        <w:t>.</w:t>
-      </w:r>
-    </w:p>
-    <w:p>
-      <w:pPr>
-        <w:rPr>
-          <w:sz w:val="28"/>
-          <w:szCs w:val="28"/>
-        </w:rPr>
-      </w:pPr>
-      <w:r>
-        <w:rPr>
-          <w:sz w:val="28"/>
-          <w:szCs w:val="28"/>
-        </w:rPr>
-        <w:t xml:space="preserve">On a des </w:t>
-      </w:r>
-      <w:r>
-        <w:rPr>
-          <w:b/>
-          <w:bCs/>
-          <w:sz w:val="28"/>
-          <w:szCs w:val="28"/>
-        </w:rPr>
-        <w:t>chaussures</w:t>
-      </w:r>
-      <w:r>
-        <w:rPr>
-          <w:sz w:val="28"/>
-          <w:szCs w:val="28"/>
-        </w:rPr>
-        <w:t xml:space="preserve"> pour esquiver, un </w:t>
-      </w:r>
-      <w:r>
-        <w:rPr>
-          <w:b/>
-          <w:bCs/>
-          <w:sz w:val="28"/>
-          <w:szCs w:val="28"/>
-        </w:rPr>
-        <w:t>katana</w:t>
-      </w:r>
-      <w:r>
-        <w:rPr>
-          <w:sz w:val="28"/>
-          <w:szCs w:val="28"/>
-        </w:rPr>
-        <w:t xml:space="preserve"> pour attaquer, et un </w:t>
-      </w:r>
-      <w:r>
-        <w:rPr>
-          <w:b/>
-          <w:bCs/>
-          <w:sz w:val="28"/>
-          <w:szCs w:val="28"/>
-        </w:rPr>
-        <w:t>ordinateur portable</w:t>
-      </w:r>
-      <w:r>
-        <w:rPr>
-          <w:sz w:val="28"/>
-          <w:szCs w:val="28"/>
-        </w:rPr>
-        <w:t xml:space="preserve"> pour hacker des portes, des ordinateurs </w:t>
-      </w:r>
-      <w:proofErr w:type="spellStart"/>
-      <w:r>
-        <w:rPr>
-          <w:sz w:val="28"/>
-          <w:szCs w:val="28"/>
-        </w:rPr>
-        <w:t>etc</w:t>
-      </w:r>
-      <w:proofErr w:type="spellEnd"/>
-      <w:r>
-        <w:rPr>
-          <w:sz w:val="28"/>
-          <w:szCs w:val="28"/>
-        </w:rPr>
-        <w:t xml:space="preserve"> </w:t>
-      </w:r>
-      <w:proofErr w:type="spellStart"/>
-      <w:r>
-        <w:rPr>
-          <w:sz w:val="28"/>
-          <w:szCs w:val="28"/>
-        </w:rPr>
-        <w:t>etc</w:t>
-      </w:r>
-      <w:proofErr w:type="spellEnd"/>
-    </w:p>
-    <w:p>
-      <w:pPr>
-        <w:rPr>
-          <w:sz w:val="28"/>
-          <w:szCs w:val="28"/>
-        </w:rPr>
-      </w:pPr>
-      <w:r>
-        <w:rPr>
-          <w:sz w:val="28"/>
-          <w:szCs w:val="28"/>
-        </w:rPr>
-        <w:t xml:space="preserve">On doit trouver des </w:t>
-      </w:r>
-      <w:r>
-        <w:rPr>
-          <w:b/>
-          <w:bCs/>
-          <w:sz w:val="28"/>
-          <w:szCs w:val="28"/>
-        </w:rPr>
-        <w:t>clés</w:t>
-      </w:r>
-      <w:r>
-        <w:rPr>
-          <w:b/>
-          <w:bCs/>
-          <w:sz w:val="28"/>
-          <w:szCs w:val="28"/>
-        </w:rPr>
-        <w:t xml:space="preserve"> d’ascenseur</w:t>
-      </w:r>
-      <w:r>
-        <w:rPr>
-          <w:sz w:val="28"/>
-          <w:szCs w:val="28"/>
-        </w:rPr>
-        <w:t xml:space="preserve"> dans les étages qui nous permettent de débloquer les étages suivants, et donc de s’approcher de la surface.</w:t>
-      </w:r>
-    </w:p>
-    <w:p>
-      <w:pPr>
-        <w:rPr>
-          <w:b/>
-          <w:bCs/>
-          <w:sz w:val="28"/>
-          <w:szCs w:val="28"/>
-        </w:rPr>
-      </w:pPr>
-    </w:p>
-    <w:p>
-      <w:pPr>
-        <w:rPr>
-          <w:b/>
-          <w:bCs/>
-          <w:sz w:val="28"/>
-          <w:szCs w:val="28"/>
-        </w:rPr>
-      </w:pPr>
-    </w:p>
-    <w:p>
-      <w:pPr>
-        <w:rPr>
-          <w:b/>
-          <w:bCs/>
-          <w:sz w:val="28"/>
-          <w:szCs w:val="28"/>
-        </w:rPr>
-      </w:pPr>
-    </w:p>
-    <w:p>
-      <w:pPr>
-        <w:rPr>
-          <w:b/>
-          <w:bCs/>
+      </w:pPr>
+    </w:p>
+    <w:p>
+      <w:pPr>
+        <w:rPr>
+          <w:b/>
+          <w:bCs/>
+          <w:sz w:val="36"/>
+          <w:szCs w:val="36"/>
+        </w:rPr>
+      </w:pPr>
+      <w:r>
+        <w:rPr>
+          <w:b/>
+          <w:bCs/>
+          <w:sz w:val="36"/>
+          <w:szCs w:val="36"/>
+        </w:rPr>
+        <w:t>Télécharger la dernière démo</w:t>
+      </w:r>
+      <w:r>
+        <w:rPr>
+          <w:b/>
+          <w:bCs/>
+          <w:sz w:val="36"/>
+          <w:szCs w:val="36"/>
+        </w:rPr>
+        <w:t> :</w:t>
+      </w:r>
+    </w:p>
+    <w:p>
+      <w:pPr>
+        <w:rPr>
+          <w:sz w:val="28"/>
+          <w:szCs w:val="28"/>
+        </w:rPr>
+      </w:pPr>
+      <w:hyperlink r:id="rId5" w:history="1">
+        <w:r>
+          <w:rPr>
+            <w:rStyle w:val="Lienhypertexte"/>
+            <w:sz w:val="28"/>
+            <w:szCs w:val="28"/>
+          </w:rPr>
+          <w:t>https://github.com/louisaiva/</w:t>
+        </w:r>
+        <w:r>
+          <w:rPr>
+            <w:rStyle w:val="Lienhypertexte"/>
+            <w:sz w:val="28"/>
+            <w:szCs w:val="28"/>
+          </w:rPr>
+          <w:t>s</w:t>
+        </w:r>
+        <w:r>
+          <w:rPr>
+            <w:rStyle w:val="Lienhypertexte"/>
+            <w:sz w:val="28"/>
+            <w:szCs w:val="28"/>
+          </w:rPr>
+          <w:t>ubrunner/releases/tag/v1.4.10b-alpha</w:t>
+        </w:r>
+      </w:hyperlink>
+    </w:p>
+    <w:p>
+      <w:pPr>
+        <w:rPr>
+          <w:sz w:val="28"/>
+          <w:szCs w:val="28"/>
+        </w:rPr>
+      </w:pPr>
+      <w:r>
+        <w:rPr>
+          <w:sz w:val="28"/>
+          <w:szCs w:val="28"/>
+        </w:rPr>
+        <w:t>(</w:t>
+      </w:r>
+      <w:proofErr w:type="gramStart"/>
+      <w:r>
+        <w:rPr>
+          <w:sz w:val="28"/>
+          <w:szCs w:val="28"/>
+        </w:rPr>
+        <w:t>c’est</w:t>
+      </w:r>
+      <w:proofErr w:type="gramEnd"/>
+      <w:r>
+        <w:rPr>
+          <w:sz w:val="28"/>
+          <w:szCs w:val="28"/>
+        </w:rPr>
+        <w:t xml:space="preserve"> une vieille version y’a plein de trucs qui sont en train de changer)</w:t>
+      </w:r>
+    </w:p>
+    <w:p>
+      <w:pPr>
+        <w:rPr>
           <w:sz w:val="32"/>
           <w:szCs w:val="32"/>
         </w:rPr>
       </w:pPr>
-      <w:r>
-        <w:rPr>
-          <w:b/>
-          <w:bCs/>
-          <w:sz w:val="32"/>
-          <w:szCs w:val="32"/>
-        </w:rPr>
-        <w:t>Inspirations globales</w:t>
-      </w:r>
-      <w:r>
-        <w:rPr>
-          <w:b/>
-          <w:bCs/>
-          <w:sz w:val="32"/>
-          <w:szCs w:val="32"/>
-        </w:rPr>
-        <w:t> :</w:t>
+    </w:p>
+    <w:p>
+      <w:pPr>
+        <w:rPr>
+          <w:b/>
+          <w:bCs/>
+          <w:sz w:val="36"/>
+          <w:szCs w:val="36"/>
+        </w:rPr>
+      </w:pPr>
+      <w:r>
+        <w:rPr>
+          <w:b/>
+          <w:bCs/>
+          <w:sz w:val="36"/>
+          <w:szCs w:val="36"/>
+        </w:rPr>
+        <w:t>Inspirations globales :</w:t>
       </w:r>
     </w:p>
     <w:p>
@@ -486,6 +558,13 @@
         <w:t>Soulsilver</w:t>
       </w:r>
       <w:proofErr w:type="spellEnd"/>
+      <w:r>
+        <w:rPr>
+          <w:sz w:val="28"/>
+          <w:szCs w:val="28"/>
+        </w:rPr>
+        <w:t xml:space="preserve"> pour la DA et graphismes</w:t>
+      </w:r>
     </w:p>
     <w:p>
       <w:pPr>
@@ -538,51 +617,31 @@
     </w:p>
     <w:p>
       <w:pPr>
-        <w:rPr>
-          <w:b/>
-          <w:bCs/>
-          <w:sz w:val="28"/>
-          <w:szCs w:val="28"/>
-        </w:rPr>
-      </w:pPr>
-    </w:p>
-    <w:p>
-      <w:pPr>
-        <w:rPr>
-          <w:b/>
-          <w:bCs/>
-          <w:sz w:val="28"/>
-          <w:szCs w:val="28"/>
-        </w:rPr>
-      </w:pPr>
-    </w:p>
-    <w:p>
-      <w:pPr>
-        <w:rPr>
-          <w:b/>
-          <w:bCs/>
-          <w:sz w:val="28"/>
-          <w:szCs w:val="28"/>
-        </w:rPr>
-      </w:pPr>
-    </w:p>
-    <w:p>
-      <w:pPr>
-        <w:rPr>
-          <w:b/>
-          <w:bCs/>
-          <w:sz w:val="28"/>
-          <w:szCs w:val="28"/>
-        </w:rPr>
-      </w:pPr>
-    </w:p>
-    <w:p>
-      <w:pPr>
-        <w:rPr>
-          <w:b/>
-          <w:bCs/>
-          <w:sz w:val="32"/>
-          <w:szCs w:val="32"/>
+        <w:pStyle w:val="Paragraphedeliste"/>
+        <w:numPr>
+          <w:ilvl w:val="0"/>
+          <w:numId w:val="2"/>
+        </w:numPr>
+        <w:rPr>
+          <w:sz w:val="28"/>
+          <w:szCs w:val="28"/>
+        </w:rPr>
+      </w:pPr>
+      <w:r>
+        <w:rPr>
+          <w:sz w:val="28"/>
+          <w:szCs w:val="28"/>
+        </w:rPr>
+        <w:t>Céleste</w:t>
+      </w:r>
+    </w:p>
+    <w:p>
+      <w:pPr>
+        <w:rPr>
+          <w:b/>
+          <w:bCs/>
+          <w:sz w:val="36"/>
+          <w:szCs w:val="36"/>
         </w:rPr>
       </w:pPr>
       <w:proofErr w:type="spellStart"/>
@@ -590,8 +649,8 @@
         <w:rPr>
           <w:b/>
           <w:bCs/>
-          <w:sz w:val="32"/>
-          <w:szCs w:val="32"/>
+          <w:sz w:val="36"/>
+          <w:szCs w:val="36"/>
         </w:rPr>
         <w:lastRenderedPageBreak/>
         <w:t>Screenshots</w:t>
@@ -601,8 +660,8 @@
         <w:rPr>
           <w:b/>
           <w:bCs/>
-          <w:sz w:val="32"/>
-          <w:szCs w:val="32"/>
+          <w:sz w:val="36"/>
+          <w:szCs w:val="36"/>
         </w:rPr>
         <w:t> :</w:t>
       </w:r>
@@ -620,17 +679,18 @@
         <w:rPr>
           <w:b/>
           <w:bCs/>
+          <w:noProof/>
           <w:sz w:val="28"/>
           <w:szCs w:val="28"/>
         </w:rPr>
         <w:drawing>
-          <wp:anchor distT="0" distB="0" distL="114300" distR="114300" simplePos="0" relativeHeight="251661312" behindDoc="0" locked="0" layoutInCell="1" allowOverlap="1" wp14:anchorId="22E343AA" wp14:editId="143E2B85">
+          <wp:anchor distT="0" distB="0" distL="114300" distR="114300" simplePos="0" relativeHeight="251661312" behindDoc="0" locked="0" layoutInCell="1" allowOverlap="1" wp14:anchorId="22E343AA" wp14:editId="161E76A4">
             <wp:simplePos x="0" y="0"/>
             <wp:positionH relativeFrom="page">
-              <wp:posOffset>3702685</wp:posOffset>
+              <wp:posOffset>3660893</wp:posOffset>
             </wp:positionH>
             <wp:positionV relativeFrom="paragraph">
-              <wp:posOffset>2769235</wp:posOffset>
+              <wp:posOffset>2809358</wp:posOffset>
             </wp:positionV>
             <wp:extent cx="3693795" cy="2571750"/>
             <wp:effectExtent l="0" t="0" r="1905" b="0"/>
@@ -647,7 +707,7 @@
                     <pic:cNvPicPr/>
                   </pic:nvPicPr>
                   <pic:blipFill rotWithShape="1">
-                    <a:blip r:embed="rId5" cstate="print">
+                    <a:blip r:embed="rId6" cstate="print">
                       <a:extLst>
                         <a:ext uri="{28A0092B-C50C-407E-A947-70E740481C1C}">
                           <a14:useLocalDpi xmlns:a14="http://schemas.microsoft.com/office/drawing/2010/main" val="0"/>
@@ -692,11 +752,12 @@
         <w:rPr>
           <w:b/>
           <w:bCs/>
+          <w:noProof/>
           <w:sz w:val="28"/>
           <w:szCs w:val="28"/>
         </w:rPr>
         <w:drawing>
-          <wp:anchor distT="0" distB="0" distL="114300" distR="114300" simplePos="0" relativeHeight="251659264" behindDoc="0" locked="0" layoutInCell="1" allowOverlap="1" wp14:anchorId="620DA644" wp14:editId="3A561A5D">
+          <wp:anchor distT="0" distB="0" distL="114300" distR="114300" simplePos="0" relativeHeight="251659264" behindDoc="0" locked="0" layoutInCell="1" allowOverlap="1" wp14:anchorId="620DA644" wp14:editId="3CF980C3">
             <wp:simplePos x="0" y="0"/>
             <wp:positionH relativeFrom="column">
               <wp:posOffset>2853690</wp:posOffset>
@@ -719,7 +780,7 @@
                     <pic:cNvPicPr/>
                   </pic:nvPicPr>
                   <pic:blipFill rotWithShape="1">
-                    <a:blip r:embed="rId6" cstate="print">
+                    <a:blip r:embed="rId7" cstate="print">
                       <a:extLst>
                         <a:ext uri="{28A0092B-C50C-407E-A947-70E740481C1C}">
                           <a14:useLocalDpi xmlns:a14="http://schemas.microsoft.com/office/drawing/2010/main" val="0"/>
@@ -764,6 +825,7 @@
         <w:rPr>
           <w:b/>
           <w:bCs/>
+          <w:noProof/>
           <w:sz w:val="28"/>
           <w:szCs w:val="28"/>
         </w:rPr>
@@ -791,7 +853,7 @@
                     <pic:cNvPicPr/>
                   </pic:nvPicPr>
                   <pic:blipFill rotWithShape="1">
-                    <a:blip r:embed="rId7" cstate="print">
+                    <a:blip r:embed="rId8" cstate="print">
                       <a:extLst>
                         <a:ext uri="{28A0092B-C50C-407E-A947-70E740481C1C}">
                           <a14:useLocalDpi xmlns:a14="http://schemas.microsoft.com/office/drawing/2010/main" val="0"/>
@@ -836,6 +898,7 @@
         <w:rPr>
           <w:b/>
           <w:bCs/>
+          <w:noProof/>
           <w:sz w:val="28"/>
           <w:szCs w:val="28"/>
         </w:rPr>
@@ -863,7 +926,7 @@
                     <pic:cNvPicPr/>
                   </pic:nvPicPr>
                   <pic:blipFill rotWithShape="1">
-                    <a:blip r:embed="rId8" cstate="print">
+                    <a:blip r:embed="rId9" cstate="print">
                       <a:extLst>
                         <a:ext uri="{28A0092B-C50C-407E-A947-70E740481C1C}">
                           <a14:useLocalDpi xmlns:a14="http://schemas.microsoft.com/office/drawing/2010/main" val="0"/>
@@ -904,26 +967,6 @@
         <w:rPr>
           <w:b/>
           <w:bCs/>
-          <w:sz w:val="28"/>
-          <w:szCs w:val="28"/>
-        </w:rPr>
-      </w:pPr>
-    </w:p>
-    <w:p>
-      <w:pPr>
-        <w:rPr>
-          <w:b/>
-          <w:bCs/>
-          <w:sz w:val="28"/>
-          <w:szCs w:val="28"/>
-        </w:rPr>
-      </w:pPr>
-    </w:p>
-    <w:p>
-      <w:pPr>
-        <w:rPr>
-          <w:b/>
-          <w:bCs/>
           <w:sz w:val="32"/>
           <w:szCs w:val="32"/>
         </w:rPr>
@@ -935,34 +978,164 @@
           <w:sz w:val="32"/>
           <w:szCs w:val="32"/>
         </w:rPr>
-        <w:t xml:space="preserve">Description </w:t>
-      </w:r>
-      <w:r>
+        <w:drawing>
+          <wp:anchor distT="0" distB="0" distL="114300" distR="114300" simplePos="0" relativeHeight="251662336" behindDoc="1" locked="0" layoutInCell="1" allowOverlap="1" wp14:anchorId="3979BA10" wp14:editId="1E3B516D">
+            <wp:simplePos x="0" y="0"/>
+            <wp:positionH relativeFrom="margin">
+              <wp:align>right</wp:align>
+            </wp:positionH>
+            <wp:positionV relativeFrom="paragraph">
+              <wp:posOffset>5327650</wp:posOffset>
+            </wp:positionV>
+            <wp:extent cx="5760720" cy="3240405"/>
+            <wp:effectExtent l="0" t="0" r="0" b="0"/>
+            <wp:wrapNone/>
+            <wp:docPr id="1608161427" name="Image 1"/>
+            <wp:cNvGraphicFramePr>
+              <a:graphicFrameLocks xmlns:a="http://schemas.openxmlformats.org/drawingml/2006/main" noChangeAspect="1"/>
+            </wp:cNvGraphicFramePr>
+            <a:graphic xmlns:a="http://schemas.openxmlformats.org/drawingml/2006/main">
+              <a:graphicData uri="http://schemas.openxmlformats.org/drawingml/2006/picture">
+                <pic:pic xmlns:pic="http://schemas.openxmlformats.org/drawingml/2006/picture">
+                  <pic:nvPicPr>
+                    <pic:cNvPr id="1608161427" name=""/>
+                    <pic:cNvPicPr/>
+                  </pic:nvPicPr>
+                  <pic:blipFill>
+                    <a:blip r:embed="rId10" cstate="print">
+                      <a:extLst>
+                        <a:ext uri="{28A0092B-C50C-407E-A947-70E740481C1C}">
+                          <a14:useLocalDpi xmlns:a14="http://schemas.microsoft.com/office/drawing/2010/main" val="0"/>
+                        </a:ext>
+                      </a:extLst>
+                    </a:blip>
+                    <a:stretch>
+                      <a:fillRect/>
+                    </a:stretch>
+                  </pic:blipFill>
+                  <pic:spPr>
+                    <a:xfrm>
+                      <a:off x="0" y="0"/>
+                      <a:ext cx="5760720" cy="3240405"/>
+                    </a:xfrm>
+                    <a:prstGeom prst="rect">
+                      <a:avLst/>
+                    </a:prstGeom>
+                  </pic:spPr>
+                </pic:pic>
+              </a:graphicData>
+            </a:graphic>
+          </wp:anchor>
+        </w:drawing>
+      </w:r>
+    </w:p>
+    <w:p>
+      <w:pPr>
         <w:rPr>
           <w:b/>
           <w:bCs/>
           <w:sz w:val="32"/>
           <w:szCs w:val="32"/>
         </w:rPr>
-        <w:t>détaillée</w:t>
-      </w:r>
-      <w:r>
+      </w:pPr>
+    </w:p>
+    <w:p>
+      <w:pPr>
         <w:rPr>
           <w:b/>
           <w:bCs/>
           <w:sz w:val="32"/>
           <w:szCs w:val="32"/>
         </w:rPr>
-        <w:t xml:space="preserve"> du jeu :</w:t>
-      </w:r>
-    </w:p>
-    <w:p>
-      <w:pPr>
-        <w:rPr>
-          <w:sz w:val="28"/>
-          <w:szCs w:val="28"/>
-        </w:rPr>
-      </w:pPr>
+      </w:pPr>
+    </w:p>
+    <w:p>
+      <w:pPr>
+        <w:rPr>
+          <w:b/>
+          <w:bCs/>
+          <w:sz w:val="32"/>
+          <w:szCs w:val="32"/>
+        </w:rPr>
+      </w:pPr>
+    </w:p>
+    <w:p>
+      <w:pPr>
+        <w:rPr>
+          <w:b/>
+          <w:bCs/>
+          <w:sz w:val="32"/>
+          <w:szCs w:val="32"/>
+        </w:rPr>
+      </w:pPr>
+    </w:p>
+    <w:p>
+      <w:pPr>
+        <w:rPr>
+          <w:b/>
+          <w:bCs/>
+          <w:sz w:val="32"/>
+          <w:szCs w:val="32"/>
+        </w:rPr>
+      </w:pPr>
+    </w:p>
+    <w:p>
+      <w:pPr>
+        <w:rPr>
+          <w:b/>
+          <w:bCs/>
+          <w:sz w:val="32"/>
+          <w:szCs w:val="32"/>
+        </w:rPr>
+      </w:pPr>
+    </w:p>
+    <w:p>
+      <w:pPr>
+        <w:rPr>
+          <w:b/>
+          <w:bCs/>
+          <w:sz w:val="32"/>
+          <w:szCs w:val="32"/>
+        </w:rPr>
+      </w:pPr>
+    </w:p>
+    <w:p>
+      <w:pPr>
+        <w:rPr>
+          <w:b/>
+          <w:bCs/>
+          <w:sz w:val="36"/>
+          <w:szCs w:val="36"/>
+        </w:rPr>
+      </w:pPr>
+      <w:r>
+        <w:rPr>
+          <w:b/>
+          <w:bCs/>
+          <w:sz w:val="36"/>
+          <w:szCs w:val="36"/>
+        </w:rPr>
+        <w:lastRenderedPageBreak/>
+        <w:t>Description détaillée / L</w:t>
+      </w:r>
+      <w:r>
+        <w:rPr>
+          <w:b/>
+          <w:bCs/>
+          <w:sz w:val="36"/>
+          <w:szCs w:val="36"/>
+        </w:rPr>
+        <w:t>ore du jeu</w:t>
+      </w:r>
+      <w:r>
+        <w:rPr>
+          <w:b/>
+          <w:bCs/>
+          <w:sz w:val="36"/>
+          <w:szCs w:val="36"/>
+        </w:rPr>
+        <w:t> :</w:t>
+      </w:r>
     </w:p>
     <w:p>
       <w:pPr>
@@ -1092,15 +1265,7 @@
           <w:sz w:val="28"/>
           <w:szCs w:val="28"/>
         </w:rPr>
-        <w:t xml:space="preserve">, situé à la </w:t>
-      </w:r>
-      <w:r>
-        <w:rPr>
-          <w:sz w:val="28"/>
-          <w:szCs w:val="28"/>
-        </w:rPr>
-        <w:lastRenderedPageBreak/>
-        <w:t xml:space="preserve">surface. </w:t>
+        <w:t xml:space="preserve">, situé à la surface. </w:t>
       </w:r>
       <w:r>
         <w:rPr>
@@ -1153,21 +1318,7 @@
           <w:sz w:val="28"/>
           <w:szCs w:val="28"/>
         </w:rPr>
-        <w:t xml:space="preserve"> le but global du joueur est</w:t>
-      </w:r>
-      <w:r>
-        <w:rPr>
-          <w:sz w:val="28"/>
-          <w:szCs w:val="28"/>
-        </w:rPr>
-        <w:t xml:space="preserve"> donc </w:t>
-      </w:r>
-      <w:r>
-        <w:rPr>
-          <w:sz w:val="28"/>
-          <w:szCs w:val="28"/>
-        </w:rPr>
-        <w:t>d’atteindre la surface.</w:t>
+        <w:t xml:space="preserve"> le but global du joueur est donc d’atteindre la surface.</w:t>
       </w:r>
     </w:p>
     <w:p>
@@ -1207,7 +1358,48 @@
           <w:sz w:val="28"/>
           <w:szCs w:val="28"/>
         </w:rPr>
-        <w:t xml:space="preserve">est cependant contrôlée par une méga corpo ultra impérialiste et totalitaire, ce qui va compliquer le chemin jusqu’à la surface. </w:t>
+        <w:t>est cependant contrôlée par une méga corpo ultra impérialiste et totalitaire</w:t>
+      </w:r>
+      <w:r>
+        <w:rPr>
+          <w:sz w:val="28"/>
+          <w:szCs w:val="28"/>
+        </w:rPr>
+        <w:t xml:space="preserve"> nommée </w:t>
+      </w:r>
+      <w:r>
+        <w:rPr>
+          <w:b/>
+          <w:bCs/>
+          <w:sz w:val="28"/>
+          <w:szCs w:val="28"/>
+        </w:rPr>
+        <w:t xml:space="preserve">UP </w:t>
+      </w:r>
+      <w:proofErr w:type="gramStart"/>
+      <w:r>
+        <w:rPr>
+          <w:b/>
+          <w:bCs/>
+          <w:sz w:val="28"/>
+          <w:szCs w:val="28"/>
+        </w:rPr>
+        <w:t xml:space="preserve">Inc. </w:t>
+      </w:r>
+      <w:r>
+        <w:rPr>
+          <w:sz w:val="28"/>
+          <w:szCs w:val="28"/>
+        </w:rPr>
+        <w:t>,</w:t>
+      </w:r>
+      <w:proofErr w:type="gramEnd"/>
+      <w:r>
+        <w:rPr>
+          <w:sz w:val="28"/>
+          <w:szCs w:val="28"/>
+        </w:rPr>
+        <w:t xml:space="preserve"> ce qui va compliquer le chemin jusqu’à la surface. </w:t>
       </w:r>
       <w:r>
         <w:rPr>
@@ -1223,28 +1415,21 @@
           <w:sz w:val="28"/>
           <w:szCs w:val="28"/>
         </w:rPr>
-        <w:t xml:space="preserve">est quant à elle </w:t>
-      </w:r>
-      <w:r>
-        <w:rPr>
-          <w:sz w:val="28"/>
-          <w:szCs w:val="28"/>
-        </w:rPr>
-        <w:t>peuplé</w:t>
-      </w:r>
-      <w:r>
-        <w:rPr>
-          <w:sz w:val="28"/>
-          <w:szCs w:val="28"/>
-        </w:rPr>
-        <w:t>e</w:t>
-      </w:r>
-      <w:r>
-        <w:rPr>
-          <w:sz w:val="28"/>
-          <w:szCs w:val="28"/>
-        </w:rPr>
-        <w:t>s de plusieurs factions :</w:t>
+        <w:t xml:space="preserve">est </w:t>
+      </w:r>
+      <w:r>
+        <w:rPr>
+          <w:sz w:val="28"/>
+          <w:szCs w:val="28"/>
+        </w:rPr>
+        <w:t xml:space="preserve">contrôlée en partie par la méga corpo, surtout aux étages proches de la surface. On y retrouve donc plusieurs factions </w:t>
+      </w:r>
+      <w:r>
+        <w:rPr>
+          <w:sz w:val="28"/>
+          <w:szCs w:val="28"/>
+        </w:rPr>
+        <w:t>:</w:t>
       </w:r>
     </w:p>
     <w:p>
@@ -1287,6 +1472,13 @@
           <w:sz w:val="28"/>
           <w:szCs w:val="28"/>
         </w:rPr>
+        <w:t xml:space="preserve">(en dessous du -2) </w:t>
+      </w:r>
+      <w:r>
+        <w:rPr>
+          <w:sz w:val="28"/>
+          <w:szCs w:val="28"/>
+        </w:rPr>
         <w:t xml:space="preserve">leur but est de renverser la </w:t>
       </w:r>
       <w:proofErr w:type="spellStart"/>
@@ -1334,6 +1526,13 @@
         </w:rPr>
         <w:t xml:space="preserve"> : </w:t>
       </w:r>
+      <w:r>
+        <w:rPr>
+          <w:sz w:val="28"/>
+          <w:szCs w:val="28"/>
+        </w:rPr>
+        <w:t xml:space="preserve">(du -2 au -5) </w:t>
+      </w:r>
       <w:proofErr w:type="gramStart"/>
       <w:r>
         <w:rPr>
@@ -1370,25 +1569,102 @@
         </w:rPr>
         <w:t xml:space="preserve">Les </w:t>
       </w:r>
-      <w:r>
-        <w:rPr>
-          <w:b/>
-          <w:bCs/>
-          <w:sz w:val="28"/>
-          <w:szCs w:val="28"/>
-        </w:rPr>
-        <w:t>Defenders</w:t>
-      </w:r>
-      <w:r>
-        <w:rPr>
-          <w:sz w:val="28"/>
-          <w:szCs w:val="28"/>
-        </w:rPr>
-        <w:t xml:space="preserve"> : la police de la </w:t>
-      </w:r>
       <w:proofErr w:type="spellStart"/>
       <w:r>
         <w:rPr>
+          <w:b/>
+          <w:bCs/>
+          <w:sz w:val="28"/>
+          <w:szCs w:val="28"/>
+        </w:rPr>
+        <w:t>Developpeurs</w:t>
+      </w:r>
+      <w:proofErr w:type="spellEnd"/>
+      <w:r>
+        <w:rPr>
+          <w:b/>
+          <w:bCs/>
+          <w:sz w:val="28"/>
+          <w:szCs w:val="28"/>
+        </w:rPr>
+        <w:t> </w:t>
+      </w:r>
+      <w:r>
+        <w:rPr>
+          <w:sz w:val="28"/>
+          <w:szCs w:val="28"/>
+        </w:rPr>
+        <w:t xml:space="preserve">: (-1 et -2 principalement) sont exploités par la méga corpo, travaillent toute la journée à générer du bitcoin, </w:t>
+      </w:r>
+      <w:proofErr w:type="gramStart"/>
+      <w:r>
+        <w:rPr>
+          <w:sz w:val="28"/>
+          <w:szCs w:val="28"/>
+        </w:rPr>
+        <w:t>ils sont pas</w:t>
+      </w:r>
+      <w:proofErr w:type="gramEnd"/>
+      <w:r>
+        <w:rPr>
+          <w:sz w:val="28"/>
+          <w:szCs w:val="28"/>
+        </w:rPr>
+        <w:t xml:space="preserve"> méchants mais se défendent si on les attaque</w:t>
+      </w:r>
+    </w:p>
+    <w:p>
+      <w:pPr>
+        <w:pStyle w:val="Paragraphedeliste"/>
+        <w:numPr>
+          <w:ilvl w:val="0"/>
+          <w:numId w:val="1"/>
+        </w:numPr>
+        <w:rPr>
+          <w:sz w:val="28"/>
+          <w:szCs w:val="28"/>
+        </w:rPr>
+      </w:pPr>
+      <w:r>
+        <w:rPr>
+          <w:sz w:val="28"/>
+          <w:szCs w:val="28"/>
+        </w:rPr>
+        <w:t xml:space="preserve">Les </w:t>
+      </w:r>
+      <w:r>
+        <w:rPr>
+          <w:b/>
+          <w:bCs/>
+          <w:sz w:val="28"/>
+          <w:szCs w:val="28"/>
+        </w:rPr>
+        <w:t>Policiers</w:t>
+      </w:r>
+      <w:r>
+        <w:rPr>
+          <w:sz w:val="28"/>
+          <w:szCs w:val="28"/>
+        </w:rPr>
+        <w:t xml:space="preserve"> : </w:t>
+      </w:r>
+      <w:r>
+        <w:rPr>
+          <w:sz w:val="28"/>
+          <w:szCs w:val="28"/>
+        </w:rPr>
+        <w:t>(-1 et -2 principalement)</w:t>
+      </w:r>
+      <w:r>
+        <w:rPr>
+          <w:sz w:val="28"/>
+          <w:szCs w:val="28"/>
+        </w:rPr>
+        <w:t xml:space="preserve"> police de la </w:t>
+      </w:r>
+      <w:proofErr w:type="spellStart"/>
+      <w:r>
+        <w:rPr>
           <w:sz w:val="28"/>
           <w:szCs w:val="28"/>
         </w:rPr>
@@ -1400,7 +1676,35 @@
           <w:sz w:val="28"/>
           <w:szCs w:val="28"/>
         </w:rPr>
-        <w:t>, veut tuer tout ce qui bouge aussi, est accompagné</w:t>
+        <w:t xml:space="preserve">, </w:t>
+      </w:r>
+      <w:r>
+        <w:rPr>
+          <w:sz w:val="28"/>
+          <w:szCs w:val="28"/>
+        </w:rPr>
+        <w:t>veut tuer les zombies et les hackers</w:t>
+      </w:r>
+      <w:r>
+        <w:rPr>
+          <w:sz w:val="28"/>
+          <w:szCs w:val="28"/>
+        </w:rPr>
+        <w:t>,</w:t>
+      </w:r>
+      <w:r>
+        <w:rPr>
+          <w:sz w:val="28"/>
+          <w:szCs w:val="28"/>
+        </w:rPr>
+        <w:t xml:space="preserve"> et surveille les développeurs. Ils sont</w:t>
+      </w:r>
+      <w:r>
+        <w:rPr>
+          <w:sz w:val="28"/>
+          <w:szCs w:val="28"/>
+        </w:rPr>
+        <w:t xml:space="preserve"> accompagné</w:t>
       </w:r>
       <w:r>
         <w:rPr>
@@ -2349,6 +2653,7 @@
   <w:style w:type="character" w:default="1" w:styleId="Policepardfaut">
     <w:name w:val="Default Paragraph Font"/>
     <w:uiPriority w:val="1"/>
+    <w:semiHidden/>
     <w:unhideWhenUsed/>
   </w:style>
   <w:style w:type="table" w:default="1" w:styleId="TableauNormal">
@@ -2660,6 +2965,41 @@
       <w:smallCaps/>
       <w:color w:val="0F4761" w:themeColor="accent1" w:themeShade="BF"/>
       <w:spacing w:val="5"/>
+    </w:rPr>
+  </w:style>
+  <w:style w:type="character" w:styleId="Lienhypertexte">
+    <w:name w:val="Hyperlink"/>
+    <w:basedOn w:val="Policepardfaut"/>
+    <w:uiPriority w:val="99"/>
+    <w:unhideWhenUsed/>
+    <w:rsid w:val="003724D5"/>
+    <w:rPr>
+      <w:color w:val="467886" w:themeColor="hyperlink"/>
+      <w:u w:val="single"/>
+    </w:rPr>
+  </w:style>
+  <w:style w:type="character" w:styleId="Mentionnonrsolue">
+    <w:name w:val="Unresolved Mention"/>
+    <w:basedOn w:val="Policepardfaut"/>
+    <w:uiPriority w:val="99"/>
+    <w:semiHidden/>
+    <w:unhideWhenUsed/>
+    <w:rsid w:val="003724D5"/>
+    <w:rPr>
+      <w:color w:val="605E5C"/>
+      <w:shd w:val="clear" w:color="auto" w:fill="E1DFDD"/>
+    </w:rPr>
+  </w:style>
+  <w:style w:type="character" w:styleId="Lienhypertextesuivivisit">
+    <w:name w:val="FollowedHyperlink"/>
+    <w:basedOn w:val="Policepardfaut"/>
+    <w:uiPriority w:val="99"/>
+    <w:semiHidden/>
+    <w:unhideWhenUsed/>
+    <w:rsid w:val="003724D5"/>
+    <w:rPr>
+      <w:color w:val="96607D" w:themeColor="followedHyperlink"/>
+      <w:u w:val="single"/>
     </w:rPr>
   </w:style>
 </w:styles>

</xml_diff>